<commit_message>
feat: export consultation reservations to Excel with parsed start and end times
</commit_message>
<xml_diff>
--- a/public/Lighthouse_PTC_Admin_Manual.docx
+++ b/public/Lighthouse_PTC_Admin_Manual.docx
@@ -734,6 +734,148 @@
           <w:sz w:val="19"/>
         </w:rPr>
         <w:t>회색 하이픈 셀 (-): 아직 예약되지 않은 빈 시간대(예약 가능)입니다.</w:t>
+      </w:r>
+    </w:p>
+    <w:p>
+      <w:pPr>
+        <w:spacing w:before="240" w:after="80"/>
+      </w:pPr>
+      <w:r>
+        <w:rPr>
+          <w:rFonts w:ascii="Malgun Gothic" w:hAnsi="Malgun Gothic"/>
+          <w:b/>
+          <w:color w:val="0F172A"/>
+          <w:sz w:val="23"/>
+        </w:rPr>
+        <w:t>3.3 상담 일정 및 예약 현황 엑셀 다운로드 (시작·종료시간 분리)</w:t>
+      </w:r>
+    </w:p>
+    <w:p>
+      <w:pPr>
+        <w:spacing w:after="80" w:line="300" w:lineRule="auto"/>
+      </w:pPr>
+      <w:r>
+        <w:rPr>
+          <w:rFonts w:ascii="Malgun Gothic" w:hAnsi="Malgun Gothic"/>
+          <w:color w:val="334155"/>
+          <w:sz w:val="20"/>
+        </w:rPr>
+        <w:t>운영자 화면과 교사 화면에서 모든 상담 일정을 엑셀(CSV) 파일로 원클릭 다운로드할 수 있습니다. 엑셀에서 정렬, 필터링, 시간 계산이 용이하도록 상담 시작시간과 종료시간이 독립된 열로 자동 파싱되어 제공됩니다.</w:t>
+      </w:r>
+    </w:p>
+    <w:p>
+      <w:pPr>
+        <w:pStyle w:val="ListBullet"/>
+        <w:spacing w:after="60" w:line="288" w:lineRule="auto"/>
+      </w:pPr>
+      <w:r>
+        <w:rPr>
+          <w:rFonts w:ascii="Malgun Gothic" w:hAnsi="Malgun Gothic"/>
+          <w:b/>
+          <w:color w:val="0F172A"/>
+          <w:sz w:val="19"/>
+        </w:rPr>
+        <w:t xml:space="preserve">• </w:t>
+      </w:r>
+      <w:r>
+        <w:rPr>
+          <w:rFonts w:ascii="Malgun Gothic" w:hAnsi="Malgun Gothic"/>
+          <w:color w:val="334155"/>
+          <w:sz w:val="19"/>
+        </w:rPr>
+        <w:t>운영자 종합 상황판: 상단의 [상담일정 엑셀 다운로드] 버튼을 클릭하면 전체 교사의 확정된 예약 목록이 일자 및 시작시간순으로 자동 정렬되어 다운로드됩니다.</w:t>
+      </w:r>
+    </w:p>
+    <w:p>
+      <w:pPr>
+        <w:pStyle w:val="ListBullet"/>
+        <w:spacing w:after="60" w:line="288" w:lineRule="auto"/>
+      </w:pPr>
+      <w:r>
+        <w:rPr>
+          <w:rFonts w:ascii="Malgun Gothic" w:hAnsi="Malgun Gothic"/>
+          <w:b/>
+          <w:color w:val="0F172A"/>
+          <w:sz w:val="19"/>
+        </w:rPr>
+        <w:t xml:space="preserve">• </w:t>
+      </w:r>
+      <w:r>
+        <w:rPr>
+          <w:rFonts w:ascii="Malgun Gothic" w:hAnsi="Malgun Gothic"/>
+          <w:color w:val="334155"/>
+          <w:sz w:val="19"/>
+        </w:rPr>
+        <w:t>실시간 예약 검색 창: 검색창에 검색어가 입력된 상태에서는 [검색결과 엑셀 다운로드], 미입력 상태에서는 [예약현황 엑셀 다운로드] 버튼으로 원하는 범위의 데이터를 즉시 추출합니다.</w:t>
+      </w:r>
+    </w:p>
+    <w:p>
+      <w:pPr>
+        <w:pStyle w:val="ListBullet"/>
+        <w:spacing w:after="60" w:line="288" w:lineRule="auto"/>
+      </w:pPr>
+      <w:r>
+        <w:rPr>
+          <w:rFonts w:ascii="Malgun Gothic" w:hAnsi="Malgun Gothic"/>
+          <w:b/>
+          <w:color w:val="0F172A"/>
+          <w:sz w:val="19"/>
+        </w:rPr>
+        <w:t xml:space="preserve">• </w:t>
+      </w:r>
+      <w:r>
+        <w:rPr>
+          <w:rFonts w:ascii="Malgun Gothic" w:hAnsi="Malgun Gothic"/>
+          <w:color w:val="334155"/>
+          <w:sz w:val="19"/>
+        </w:rPr>
+        <w:t>교사 전용 포털(/teacher): 담당 교사가 본인의 타임테이블 상단에서 [일정 엑셀 다운로드 (시작·종료시간 분리)] 버튼을 클릭하여 본인 일정만 엑셀로 내려받을 수 있습니다.</w:t>
+      </w:r>
+    </w:p>
+    <w:p>
+      <w:pPr>
+        <w:pStyle w:val="ListBullet"/>
+        <w:spacing w:after="60" w:line="288" w:lineRule="auto"/>
+      </w:pPr>
+      <w:r>
+        <w:rPr>
+          <w:rFonts w:ascii="Malgun Gothic" w:hAnsi="Malgun Gothic"/>
+          <w:b/>
+          <w:color w:val="0F172A"/>
+          <w:sz w:val="19"/>
+        </w:rPr>
+        <w:t xml:space="preserve">• </w:t>
+      </w:r>
+      <w:r>
+        <w:rPr>
+          <w:rFonts w:ascii="Malgun Gothic" w:hAnsi="Malgun Gothic"/>
+          <w:color w:val="334155"/>
+          <w:sz w:val="19"/>
+        </w:rPr>
+        <w:t>제공되는 엑셀 열(컬럼): 예약번호(Slip ID), 상담 일자, 상담 시작시간(24시간제), 상담 종료시간(24시간제), 상담 시간대(슬롯), 시작시간(12시간제), 종료시간(12시간제), 학생 학년, 학생 성명, 학부모 성명, 학부모 이메일, 상담 교사, 상담 교과, 예약 상태, 신청 일시</w:t>
+      </w:r>
+    </w:p>
+    <w:p>
+      <w:pPr>
+        <w:pStyle w:val="ListBullet"/>
+        <w:spacing w:after="60" w:line="288" w:lineRule="auto"/>
+      </w:pPr>
+      <w:r>
+        <w:rPr>
+          <w:rFonts w:ascii="Malgun Gothic" w:hAnsi="Malgun Gothic"/>
+          <w:b/>
+          <w:color w:val="0F172A"/>
+          <w:sz w:val="19"/>
+        </w:rPr>
+        <w:t xml:space="preserve">• </w:t>
+      </w:r>
+      <w:r>
+        <w:rPr>
+          <w:rFonts w:ascii="Malgun Gothic" w:hAnsi="Malgun Gothic"/>
+          <w:color w:val="334155"/>
+          <w:sz w:val="19"/>
+        </w:rPr>
+        <w:t>Excel 완벽 호환: UTF-8 BOM 인코딩을 적용하여 별도의 변환 없이 Microsoft Excel에서 더블클릭만으로 한글 깨짐 없이 즉시 정상 조회됩니다.</w:t>
       </w:r>
     </w:p>
     <w:p>

</xml_diff>